<commit_message>
DU corrected on the growth-basis error
Its terminal was handed a profit figure, a depreciation charge and a working-
capital balance all already grown by (1+g), which the sanctioned construction
grows again. Central 16.8563 -> 16.5778, gap +48.4% -> +45.9%.

The terminal lever reads 16.4935 corrected against the 16.7705 it carried, so
the route is 18.8909 -> 17.1542 -> 16.4935 -> 16.5778 and the cumulative is
-12.24%. It takes more off, not less.

The workbook's own terminal waterfall carried the same growth in its formulas
and is corrected with it, without moving a row -- a dozen formulas on five
other sheets name cells in that block by address.

Study checks: recalc 844 of 844 formula cells with 42 headline
reconciliations, drivers, prose figures and table footing all clean.

One study remains: MODON.

Co-Authored-By: Claude Opus 5 <noreply@anthropic.com>
Claude-Session: https://claude.ai/code/session_017RcjXG4ETjADcoFJf123yY
</commit_message>
<xml_diff>
--- a/engine/du_study/DU_Valuation_Study_09-08-2026_public.docx
+++ b/engine/du_study/DU_Valuation_Study_09-08-2026_public.docx
@@ -191,7 +191,7 @@
                 <w:color w:val="1C3A36"/>
                 <w:sz w:val="19"/>
               </w:rPr>
-              <w:t>Central AED 16.86 per share against a spot of AED 11.36 (+48%), inside a bear-to-bull range of AED 10.74 to 28.44. That central IS the cash-flow lens, not an average of several: the other lenses are published beside it as cross-checks at their own values, and the market-anchored relative lens reads AED 8.90. That gap is the study's honest tension, and section 4 explains rather than dissolves it.</w:t>
+              <w:t>Central AED 16.58 per share against a spot of AED 11.36 (+46%), inside a bear-to-bull range of AED 10.57 to 27.67. That central IS the cash-flow lens, not an average of several: the other lenses are published beside it as cross-checks at their own values, and the market-anchored relative lens reads AED 8.90. That gap is the study's honest tension, and section 4 explains rather than dissolves it.</w:t>
             </w:r>
           </w:p>
           <w:p>
@@ -211,7 +211,7 @@
                 <w:color w:val="1C3A36"/>
                 <w:sz w:val="19"/>
               </w:rPr>
-              <w:t>What required return does this business deserve? On du's own measured beta the cash-flow lens reads AED 16.86 — but the terminal that implies values du at 8.8x forward EBITDA in perpetuity, against the 7.0x the market pays for it today. Refuse that re-rating and hold today's multiple instead and the same cash flows are worth AED 13.89. Both are published side by side — the judgement is worth AED 2.96 per share and is never averaged into one number.</w:t>
+              <w:t>What required return does this business deserve? On du's own measured beta the cash-flow lens reads AED 16.58 — but the terminal that implies values du at 8.6x forward EBITDA in perpetuity, against the 7.0x the market pays for it today. Refuse that re-rating and hold today's multiple instead and the same cash flows are worth AED 13.89. Both are published side by side — the judgement is worth AED 2.68 per share and is never averaged into one number.</w:t>
             </w:r>
           </w:p>
           <w:p>
@@ -454,7 +454,7 @@
                 <w:color w:val="1C3A36"/>
                 <w:sz w:val="17"/>
               </w:rPr>
-              <w:t>10.74</w:t>
+              <w:t>10.57</w:t>
             </w:r>
           </w:p>
         </w:tc>
@@ -472,7 +472,7 @@
                 <w:color w:val="1C3A36"/>
                 <w:sz w:val="17"/>
               </w:rPr>
-              <w:t>16.86</w:t>
+              <w:t>16.58</w:t>
             </w:r>
           </w:p>
         </w:tc>
@@ -490,7 +490,7 @@
                 <w:color w:val="1C3A36"/>
                 <w:sz w:val="17"/>
               </w:rPr>
-              <w:t>28.44</w:t>
+              <w:t>27.67</w:t>
             </w:r>
           </w:p>
         </w:tc>
@@ -526,7 +526,7 @@
                 <w:color w:val="1C3A36"/>
                 <w:sz w:val="17"/>
               </w:rPr>
-              <w:t>+48%</w:t>
+              <w:t>+46%</w:t>
             </w:r>
           </w:p>
         </w:tc>
@@ -894,7 +894,7 @@
                 <w:color w:val="1C3A36"/>
                 <w:sz w:val="17"/>
               </w:rPr>
-              <w:t>10.74</w:t>
+              <w:t>10.57</w:t>
             </w:r>
           </w:p>
         </w:tc>
@@ -914,7 +914,7 @@
                 <w:color w:val="1C3A36"/>
                 <w:sz w:val="17"/>
               </w:rPr>
-              <w:t>16.86</w:t>
+              <w:t>16.58</w:t>
             </w:r>
           </w:p>
         </w:tc>
@@ -934,7 +934,7 @@
                 <w:color w:val="1C3A36"/>
                 <w:sz w:val="17"/>
               </w:rPr>
-              <w:t>28.44</w:t>
+              <w:t>27.67</w:t>
             </w:r>
           </w:p>
         </w:tc>
@@ -974,7 +974,7 @@
                 <w:color w:val="1C3A36"/>
                 <w:sz w:val="17"/>
               </w:rPr>
-              <w:t>+48%</w:t>
+              <w:t>+46%</w:t>
             </w:r>
           </w:p>
         </w:tc>
@@ -1028,7 +1028,7 @@
                 <w:color w:val="1C3A36"/>
                 <w:sz w:val="17"/>
               </w:rPr>
-              <w:t>12.87</w:t>
+              <w:t>12.74</w:t>
             </w:r>
           </w:p>
         </w:tc>
@@ -1081,7 +1081,7 @@
                 <w:color w:val="1C3A36"/>
                 <w:sz w:val="17"/>
               </w:rPr>
-              <w:t>+13%</w:t>
+              <w:t>+12%</w:t>
             </w:r>
           </w:p>
         </w:tc>
@@ -1526,7 +1526,7 @@
           <w:color w:val="6E7B77"/>
           <w:sz w:val="17"/>
         </w:rPr>
-        <w:t>Table 1 — the valuation summary. The central is the cash-flow lens itself, AED 16.86, and its bear and bull columns are that same lens under its own two paths on one clock — NOT an envelope of four methods and NOT a weighted average of them. The other lenses are cross-checks, published at their own values so a reader sees the disagreement rather than a number in which it has been dissolved; the book lens is a disclosed floor and is never weighted, and normalised earnings power is not among this class's permitted cross-checks and is shown only so its removal is visible. The retired blend of AED 12.87 is printed for the same reason and feeds nothing. Every lens value is dated at the 2026-08-07 anchor, net of the AED 0.66 of dividends whose ex-dates fall between the 31-Dec-2025 valuation date and that anchor (the 0.40 final, paid 28-Apr-2026, and the 0.26 interim, ex 31-Jul-2026). The terminal value is 81% of the DCF enterprise value, and the terminal it implies is priced explicitly in section 1.7 rather than left as a caveat.</w:t>
+        <w:t>Table 1 — the valuation summary. The central is the cash-flow lens itself, AED 16.58, and its bear and bull columns are that same lens under its own two paths on one clock — NOT an envelope of four methods and NOT a weighted average of them. The other lenses are cross-checks, published at their own values so a reader sees the disagreement rather than a number in which it has been dissolved; the book lens is a disclosed floor and is never weighted, and normalised earnings power is not among this class's permitted cross-checks and is shown only so its removal is visible. The retired blend of AED 12.74 is printed for the same reason and feeds nothing. Every lens value is dated at the 2026-08-07 anchor, net of the AED 0.66 of dividends whose ex-dates fall between the 31-Dec-2025 valuation date and that anchor (the 0.40 final, paid 28-Apr-2026, and the 0.26 interim, ex 31-Jul-2026). The terminal value is 81% of the DCF enterprise value, and the terminal it implies is priced explicitly in section 1.7 rather than left as a caveat.</w:t>
       </w:r>
     </w:p>
     <w:p>
@@ -1678,7 +1678,7 @@
           <w:color w:val="1C3A36"/>
           <w:sz w:val="21"/>
         </w:rPr>
-        <w:t>One lens carries the answer and the rest are cross-checks. For an integrated telecom operator the primary is the discounted cash flow: the company is a licence and a network generating a distributable cash stream, so the value is the present value of that stream and nothing else measures it directly. Relative multiples are published beside it as a cross-check, the book lens as a disclosed floor that is never weighted, and normalised earnings power is shown but is NOT among this class's permitted cross-checks — it is computed here only so that its removal from the answer is visible rather than silent. The four are never averaged: an earlier edition of this study published a 45/25/20/10 weighted blend, and what those weights concealed was the SIZE of this study's disagreement with the market rather than its direction — the blend read +13% against the price where the cash-flow lens reads +48%, so a reader saw about a quarter of the disagreement actually held.</w:t>
+        <w:t>One lens carries the answer and the rest are cross-checks. For an integrated telecom operator the primary is the discounted cash flow: the company is a licence and a network generating a distributable cash stream, so the value is the present value of that stream and nothing else measures it directly. Relative multiples are published beside it as a cross-check, the book lens as a disclosed floor that is never weighted, and normalised earnings power is shown but is NOT among this class's permitted cross-checks — it is computed here only so that its removal from the answer is visible rather than silent. The four are never averaged: an earlier edition of this study published a 45/25/20/10 weighted blend, and what those weights concealed was the SIZE of this study's disagreement with the market rather than its direction — the blend read +12% against the price where the cash-flow lens reads +46%, so a reader saw about a quarter of the disagreement actually held.</w:t>
       </w:r>
     </w:p>
     <w:p>
@@ -3256,7 +3256,7 @@
           <w:color w:val="1C3A36"/>
           <w:sz w:val="21"/>
         </w:rPr>
-        <w:t>What the terminal charges for is capital MAINTENANCE, at what replacement costs. Terminal operating profit after tax is AED 3,872mn; AED 2,634mn of owned depreciation and amortisation is added back because that profit is already struck after it, and AED 3,108mn charged against it — the same charge escalated over half the 16.70-year life of the depreciable owned base. That life is not picked: the depreciation notes give RANGES per class and no weighting, so it is derived from those notes' own two columns, the gross cost of the base over the year's own charge, and cross-checks at 15.96 years on the prior year. The working-capital line is a CREDIT of AED 26mn rather than a charge, because this company collects from its subscribers before it pays its suppliers and inflation makes that float worth more each year. That leaves AED 3,425mn, 88.5% of terminal profit.</w:t>
+        <w:t>What the terminal charges for is capital MAINTENANCE, at what replacement costs. Terminal operating profit after tax is AED 3,796mn; AED 2,582mn of owned depreciation and amortisation is added back because that profit is already struck after it, and AED 3,047mn charged against it — the same charge escalated over half the 16.70-year life of the depreciable owned base. That life is not picked: the depreciation notes give RANGES per class and no weighting, so it is derived from those notes' own two columns, the gross cost of the base over the year's own charge, and cross-checks at 15.96 years on the prior year. The working-capital line is a CREDIT of AED 26mn rather than a charge, because this company collects from its subscribers before it pays its suppliers and inflation makes that float worth more each year. That leaves AED 3,358mn, 88.5% of terminal profit.</w:t>
       </w:r>
     </w:p>
     <w:p>
@@ -3284,7 +3284,7 @@
           <w:color w:val="1C3A36"/>
           <w:sz w:val="21"/>
         </w:rPr>
-        <w:t>That yields a terminal value of AED 83,691mn, whose present value is AED 61,691mn — 81% of enterprise value, against AED 85,964mn on the retired construction. A reader should sit with that share: at a 6.17% discount rate almost all of the value of a stable, licence-protected annuity IS the far future, and that is exactly why the two renewal catalysts in section 5 dominate everything else in this report. A marker beside it: a business holding its profit flat for ever, charging only the depreciation its books already record, would be worth AED 62,714mn.</w:t>
+        <w:t>That yields a terminal value of AED 82,050mn, whose present value is AED 60,481mn — 81% of enterprise value, against AED 85,964mn on the retired construction. A reader should sit with that share: at a 6.17% discount rate almost all of the value of a stable, licence-protected annuity IS the far future, and that is exactly why the two renewal catalysts in section 5 dominate everything else in this report. A marker beside it: a business holding its profit flat for ever, charging only the depreciation its books already record, would be worth AED 61,484mn.</w:t>
       </w:r>
     </w:p>
     <w:p>
@@ -3474,7 +3474,7 @@
                 <w:color w:val="1C3A36"/>
                 <w:sz w:val="18"/>
               </w:rPr>
-              <w:t>61,691</w:t>
+              <w:t>60,481</w:t>
             </w:r>
           </w:p>
         </w:tc>
@@ -3492,7 +3492,7 @@
                 <w:color w:val="1C3A36"/>
                 <w:sz w:val="18"/>
               </w:rPr>
-              <w:t>13.61</w:t>
+              <w:t>13.34</w:t>
             </w:r>
           </w:p>
         </w:tc>
@@ -3533,7 +3533,7 @@
                 <w:color w:val="1C3A36"/>
                 <w:sz w:val="18"/>
               </w:rPr>
-              <w:t>75,773</w:t>
+              <w:t>74,563</w:t>
             </w:r>
           </w:p>
         </w:tc>
@@ -3553,7 +3553,7 @@
                 <w:color w:val="1C3A36"/>
                 <w:sz w:val="18"/>
               </w:rPr>
-              <w:t>16.72</w:t>
+              <w:t>16.45</w:t>
             </w:r>
           </w:p>
         </w:tc>
@@ -3812,7 +3812,7 @@
                 <w:color w:val="1C3A36"/>
                 <w:sz w:val="18"/>
               </w:rPr>
-              <w:t>76,084</w:t>
+              <w:t>74,874</w:t>
             </w:r>
           </w:p>
         </w:tc>
@@ -3832,7 +3832,7 @@
                 <w:color w:val="1C3A36"/>
                 <w:sz w:val="18"/>
               </w:rPr>
-              <w:t>16.78</w:t>
+              <w:t>16.52</w:t>
             </w:r>
           </w:p>
         </w:tc>
@@ -3945,7 +3945,7 @@
                 <w:color w:val="1C3A36"/>
                 <w:sz w:val="18"/>
               </w:rPr>
-              <w:t>16.86</w:t>
+              <w:t>16.58</w:t>
             </w:r>
           </w:p>
         </w:tc>
@@ -3981,7 +3981,7 @@
           <w:color w:val="1C3A36"/>
           <w:sz w:val="21"/>
         </w:rPr>
-        <w:t>Scenario span on this lens: bear AED 10.74 (ARPU −5%, a quarter-million fewer subscribers, margins −3%, +100bp on the discount rate, terminal growth 2.0%), bull AED 28.44 (the war recovery runs hot and the data-centre leg compounds). The base case is deliberately NOT the midpoint of those two: it is built driver by driver in section 1.6.</w:t>
+        <w:t>Scenario span on this lens: bear AED 10.57 (ARPU −5%, a quarter-million fewer subscribers, margins −3%, +100bp on the discount rate, terminal growth 2.0%), bull AED 27.67 (the war recovery runs hot and the data-centre leg compounds). The base case is deliberately NOT the midpoint of those two: it is built driver by driver in section 1.6.</w:t>
       </w:r>
     </w:p>
     <w:p>
@@ -5050,7 +5050,7 @@
           <w:color w:val="1C3A36"/>
           <w:sz w:val="21"/>
         </w:rPr>
-        <w:t>The central is AED 16.86 (+48% to spot) and it is the cash-flow lens itself. Its range, AED 10.74 to AED 28.44, is that same lens under its own bear and bull paths on one clock — the present-value reads of one method, not the spread between four different ones. The cross-checks are published at their own values and disagree: the two market-anchored lenses read roughly at the market, the book floor at AED 12.76. Section 4 takes that disagreement seriously — it is a statement about the discount rate, not about the forecast — and the disagreement is shown rather than averaged away, because a number produced by averaging several methods is not more robust than the best of them: it is a new method with weights nobody tested, and it imports every weakness of the weakest lens at whatever weight somebody typed. Here the arithmetic of that is exact and is why the blend was retired: the retired 45/25/20/10 central of AED 12.87 read +13% against the price where the answer reads +48%.</w:t>
+        <w:t>The central is AED 16.58 (+46% to spot) and it is the cash-flow lens itself. Its range, AED 10.57 to AED 27.67, is that same lens under its own bear and bull paths on one clock — the present-value reads of one method, not the spread between four different ones. The cross-checks are published at their own values and disagree: the two market-anchored lenses read roughly at the market, the book floor at AED 12.76. Section 4 takes that disagreement seriously — it is a statement about the discount rate, not about the forecast — and the disagreement is shown rather than averaged away, because a number produced by averaging several methods is not more robust than the best of them: it is a new method with weights nobody tested, and it imports every weakness of the weakest lens at whatever weight somebody typed. Here the arithmetic of that is exact and is why the blend was retired: the retired 45/25/20/10 central of AED 12.74 read +12% against the price where the answer reads +46%.</w:t>
       </w:r>
     </w:p>
     <w:p>
@@ -5884,7 +5884,7 @@
           <w:color w:val="1C3A36"/>
           <w:sz w:val="21"/>
         </w:rPr>
-        <w:t>This matters because of what the forecast assumes elsewhere. The subscriber path in this study has prepaid RECOVERING as tourism normalises. A recovering prepaid base pushes the postpaid share back down, which removes the tailwind — and if the underlying per-leg erosion continues, the blended figure falls rather than holding flat. Holding the path flat is therefore a joint assumption that BOTH forces persist and keep cancelling. Section 1.9 prices the alternative directly: if the blended path instead erodes at the rate the decomposition implies, the cash-flow lens reads AED 13.89 rather than AED 16.86, -18%. It is the largest single downside in the study that does not come from the discount rate.</w:t>
+        <w:t>This matters because of what the forecast assumes elsewhere. The subscriber path in this study has prepaid RECOVERING as tourism normalises. A recovering prepaid base pushes the postpaid share back down, which removes the tailwind — and if the underlying per-leg erosion continues, the blended figure falls rather than holding flat. Holding the path flat is therefore a joint assumption that BOTH forces persist and keep cancelling. Section 1.9 prices the alternative directly: if the blended path instead erodes at the rate the decomposition implies, the cash-flow lens reads AED 13.66 rather than AED 16.58, -18%. It is the largest single downside in the study that does not come from the discount rate.</w:t>
       </w:r>
     </w:p>
     <w:p>
@@ -7784,7 +7784,7 @@
                 <w:color w:val="1C3A36"/>
                 <w:sz w:val="17"/>
               </w:rPr>
-              <w:t>8.81x forward EBITDA</w:t>
+              <w:t>8.64x forward EBITDA</w:t>
             </w:r>
           </w:p>
         </w:tc>
@@ -7839,7 +7839,7 @@
                 <w:color w:val="1C3A36"/>
                 <w:sz w:val="17"/>
               </w:rPr>
-              <w:t>16.86</w:t>
+              <w:t>16.58</w:t>
             </w:r>
           </w:p>
         </w:tc>
@@ -7894,7 +7894,7 @@
                 <w:color w:val="1C3A36"/>
                 <w:sz w:val="17"/>
               </w:rPr>
-              <w:t>16.86</w:t>
+              <w:t>16.58</w:t>
             </w:r>
           </w:p>
         </w:tc>
@@ -7949,7 +7949,7 @@
                 <w:color w:val="1C3A36"/>
                 <w:sz w:val="17"/>
               </w:rPr>
-              <w:t>AED 2.96 per share on the cash-flow lens</w:t>
+              <w:t>AED 2.68 per share on the cash-flow lens</w:t>
             </w:r>
           </w:p>
         </w:tc>
@@ -7988,7 +7988,7 @@
           <w:color w:val="6E7B77"/>
           <w:sz w:val="17"/>
         </w:rPr>
-        <w:t>Table 8 — the study's central judgement, both ways. The cash-flow lens rests on du's own measured beta of 0.488, which prices its equity at 6.53%. That is internally consistent — but the terminal it produces values du at 8.81 times forward EBITDA forever, against the 6.97 times the market pays today: a 26% re-rating embedded in a figure presented as intrinsic value. Framing 2 simply declines to assume it. This is the honest form of the observation that 81% of enterprise value sits beyond year five.</w:t>
+        <w:t>Table 8 — the study's central judgement, both ways. The cash-flow lens rests on du's own measured beta of 0.488, which prices its equity at 6.53%. That is internally consistent — but the terminal it produces values du at 8.64 times forward EBITDA forever, against the 6.97 times the market pays today: a 24% re-rating embedded in a figure presented as intrinsic value. Framing 2 simply declines to assume it. This is the honest form of the observation that 81% of enterprise value sits beyond year five.</w:t>
       </w:r>
     </w:p>
     <w:p>
@@ -8030,7 +8030,7 @@
           <w:color w:val="1C3A36"/>
           <w:sz w:val="21"/>
         </w:rPr>
-        <w:t>The fiscal regime was the previous edition of this study's central judgement. It is not one any more, and the correction is worth stating plainly: du published its own disclosure of the royalty extension on 24 July 2026 — "Extension of Federal Royalty Scheme for the Period 2027-2029" — carrying the same 38% royalty and 9% corporate tax and expressly retaining the AED 1.8 billion combined annual floor. The prior edition recorded, wrongly, that only the other operator had disclosed it. A reversion to the pre-2024 construction after 2029 remains a real tail and is priced: AED 14.74 per share, against AED 16.86 on the current regime. It is a tail, not a coin-flip.</w:t>
+        <w:t>The fiscal regime was the previous edition of this study's central judgement. It is not one any more, and the correction is worth stating plainly: du published its own disclosure of the royalty extension on 24 July 2026 — "Extension of Federal Royalty Scheme for the Period 2027-2029" — carrying the same 38% royalty and 9% corporate tax and expressly retaining the AED 1.8 billion combined annual floor. The prior edition recorded, wrongly, that only the other operator had disclosed it. A reversion to the pre-2024 construction after 2029 remains a real tail and is priced: AED 14.74 per share, against AED 16.58 on the current regime. It is a tail, not a coin-flip.</w:t>
       </w:r>
     </w:p>
     <w:p>
@@ -8044,7 +8044,7 @@
           <w:color w:val="1C3A36"/>
           <w:sz w:val="21"/>
         </w:rPr>
-        <w:t>The licence is the second. The regulator extended du's operating licence only to 8 August 2026 — one day after this study's anchor — and has since renewed it for twenty years from 9 August 2026. The renewal announcement sets out obligations (resilience, route diversity, quality of service, national roaming) but publishes NO fee or revenue-share terms. This study therefore holds the licence fee at its historical 2.7% of revenue and flags that as an assumption, not a confirmed fact: each additional percentage point of revenue taken in licence fees costs about AED 0.56 per share.</w:t>
+        <w:t>The licence is the second. The regulator extended du's operating licence only to 8 August 2026 — one day after this study's anchor — and has since renewed it for twenty years from 9 August 2026. The renewal announcement sets out obligations (resilience, route diversity, quality of service, national roaming) but publishes NO fee or revenue-share terms. This study therefore holds the licence fee at its historical 2.7% of revenue and flags that as an assumption, not a confirmed fact: each additional percentage point of revenue taken in licence fees costs about AED 0.55 per share.</w:t>
       </w:r>
     </w:p>
     <w:p>
@@ -8964,7 +8964,7 @@
                 <w:color w:val="1C3A36"/>
                 <w:sz w:val="16"/>
               </w:rPr>
-              <w:t>16.44 vs 16.86 (-0.42)</w:t>
+              <w:t>16.44 vs 16.58 (-0.14)</w:t>
             </w:r>
           </w:p>
         </w:tc>
@@ -9037,7 +9037,7 @@
                 <w:color w:val="1C3A36"/>
                 <w:sz w:val="16"/>
               </w:rPr>
-              <w:t>18.77 vs 16.86 (1.91)</w:t>
+              <w:t>18.77 vs 16.58 (2.19)</w:t>
             </w:r>
           </w:p>
         </w:tc>
@@ -9220,7 +9220,7 @@
                 <w:color w:val="1C3A36"/>
                 <w:sz w:val="16"/>
               </w:rPr>
-              <w:t>8.81x implied</w:t>
+              <w:t>8.64x implied</w:t>
             </w:r>
           </w:p>
         </w:tc>
@@ -9256,7 +9256,7 @@
                 <w:color w:val="1C3A36"/>
                 <w:sz w:val="16"/>
               </w:rPr>
-              <w:t>16.86 vs 13.89 — the study's central judgement</w:t>
+              <w:t>16.58 vs 13.89 — the study's central judgement</w:t>
             </w:r>
           </w:p>
         </w:tc>
@@ -9329,7 +9329,7 @@
                 <w:color w:val="1C3A36"/>
                 <w:sz w:val="16"/>
               </w:rPr>
-              <w:t>16.86 vs 14.74</w:t>
+              <w:t>16.58 vs 14.74</w:t>
             </w:r>
           </w:p>
         </w:tc>
@@ -9365,7 +9365,7 @@
           <w:color w:val="1C3A36"/>
           <w:sz w:val="21"/>
         </w:rPr>
-        <w:t>The risk-free rate deserves its own paragraph, because it is the input an external review of this study contested hardest and because the resolution runs against that review. There is no liquid ten-year dirham government point at all: the UAE federal curve's longest conventional Treasury bond matures in January 2031, and the ONLY federal tranche beyond it is a February-2033 Islamic Treasury Sukuk — a different instrument type, which an earlier edition of this study mislabelled as a bond. That sukuk has been sold twice. Its debut, in February 2026, cleared 3.779%. A second tap of the SAME instrument two months later cleared 4.13% — 35 basis points higher. The review argued for the debut print, which would put the cash-flow lens at AED 20.59 rather than AED 16.86, +22%. That is far too large to wave away, so it was re-derived from the issuer's own auction releases rather than argued about.</w:t>
+        <w:t>The risk-free rate deserves its own paragraph, because it is the input an external review of this study contested hardest and because the resolution runs against that review. There is no liquid ten-year dirham government point at all: the UAE federal curve's longest conventional Treasury bond matures in January 2031, and the ONLY federal tranche beyond it is a February-2033 Islamic Treasury Sukuk — a different instrument type, which an earlier edition of this study mislabelled as a bond. That sukuk has been sold twice. Its debut, in February 2026, cleared 3.779%. A second tap of the SAME instrument two months later cleared 4.13% — 35 basis points higher. The review argued for the debut print, which would put the cash-flow lens at AED 20.59 rather than AED 16.58, +24%. That is far too large to wave away, so it was re-derived from the issuer's own auction releases rather than argued about.</w:t>
       </w:r>
     </w:p>
     <w:p>
@@ -9379,7 +9379,7 @@
           <w:color w:val="1C3A36"/>
           <w:sz w:val="21"/>
         </w:rPr>
-        <w:t>The debut print does not survive that re-derivation. It is five and a half months older than this study's anchor, the issuer's own re-offer of the identical instrument contradicted it, and the Jan-2031 bond moved 3.90% → 3.85% → 4.30% → 4.48% across the same window. Using a stale debut as the current risk-free rate would import a rate environment that had ceased to exist. The rate used therefore stays at the most recent primary print on the longest liquid tenor, 4.48% — but the honest observation is that the tenor choice is a genuine RANGE, not a point: the two defensible longer alternatives sit on either side of it, worth 1.91 and -0.42 a share, so both are published in the table above rather than one being selected. One further correction belongs here: the spread on that auction is read FROM the ministry's release, not quoted from it. The original sentence is malformed, covering two tranches at once, and an earlier edition of this study presented it as a clean quotation. It was not.</w:t>
+        <w:t>The debut print does not survive that re-derivation. It is five and a half months older than this study's anchor, the issuer's own re-offer of the identical instrument contradicted it, and the Jan-2031 bond moved 3.90% → 3.85% → 4.30% → 4.48% across the same window. Using a stale debut as the current risk-free rate would import a rate environment that had ceased to exist. The rate used therefore stays at the most recent primary print on the longest liquid tenor, 4.48% — but the honest observation is that the tenor choice is a genuine RANGE, not a point: the two defensible longer alternatives sit on either side of it, worth 2.19 and -0.14 a share, so both are published in the table above rather than one being selected. One further correction belongs here: the spread on that auction is read FROM the ministry's release, not quoted from it. The original sentence is malformed, covering two tranches at once, and an earlier edition of this study presented it as a clean quotation. It was not.</w:t>
       </w:r>
     </w:p>
     <w:p>
@@ -9771,7 +9771,7 @@
                 <w:color w:val="1C3A36"/>
                 <w:sz w:val="16"/>
               </w:rPr>
-              <w:t>18.08</w:t>
+              <w:t>17.78</w:t>
             </w:r>
           </w:p>
         </w:tc>
@@ -9789,7 +9789,7 @@
                 <w:color w:val="1C3A36"/>
                 <w:sz w:val="16"/>
               </w:rPr>
-              <w:t>16.86</w:t>
+              <w:t>16.58</w:t>
             </w:r>
           </w:p>
         </w:tc>
@@ -9807,7 +9807,7 @@
                 <w:color w:val="1C3A36"/>
                 <w:sz w:val="16"/>
               </w:rPr>
-              <w:t>15.68</w:t>
+              <w:t>15.42</w:t>
             </w:r>
           </w:p>
         </w:tc>
@@ -9825,7 +9825,7 @@
                 <w:color w:val="1C3A36"/>
                 <w:sz w:val="16"/>
               </w:rPr>
-              <w:t>14.65</w:t>
+              <w:t>14.40</w:t>
             </w:r>
           </w:p>
         </w:tc>
@@ -9843,7 +9843,7 @@
                 <w:color w:val="1C3A36"/>
                 <w:sz w:val="16"/>
               </w:rPr>
-              <w:t>13.58</w:t>
+              <w:t>13.36</w:t>
             </w:r>
           </w:p>
         </w:tc>
@@ -9861,7 +9861,7 @@
                 <w:color w:val="1C3A36"/>
                 <w:sz w:val="16"/>
               </w:rPr>
-              <w:t>4.50</w:t>
+              <w:t>4.43</w:t>
             </w:r>
           </w:p>
         </w:tc>
@@ -9898,7 +9898,7 @@
                 <w:color w:val="1C3A36"/>
                 <w:sz w:val="16"/>
               </w:rPr>
-              <w:t>14.23</w:t>
+              <w:t>14.00</w:t>
             </w:r>
           </w:p>
         </w:tc>
@@ -9916,7 +9916,7 @@
                 <w:color w:val="1C3A36"/>
                 <w:sz w:val="16"/>
               </w:rPr>
-              <w:t>15.54</w:t>
+              <w:t>15.29</w:t>
             </w:r>
           </w:p>
         </w:tc>
@@ -9934,7 +9934,7 @@
                 <w:color w:val="1C3A36"/>
                 <w:sz w:val="16"/>
               </w:rPr>
-              <w:t>16.86</w:t>
+              <w:t>16.58</w:t>
             </w:r>
           </w:p>
         </w:tc>
@@ -9952,7 +9952,7 @@
                 <w:color w:val="1C3A36"/>
                 <w:sz w:val="16"/>
               </w:rPr>
-              <w:t>18.17</w:t>
+              <w:t>17.87</w:t>
             </w:r>
           </w:p>
         </w:tc>
@@ -9970,7 +9970,7 @@
                 <w:color w:val="1C3A36"/>
                 <w:sz w:val="16"/>
               </w:rPr>
-              <w:t>19.48</w:t>
+              <w:t>19.16</w:t>
             </w:r>
           </w:p>
         </w:tc>
@@ -9988,7 +9988,7 @@
                 <w:color w:val="1C3A36"/>
                 <w:sz w:val="16"/>
               </w:rPr>
-              <w:t>5.25</w:t>
+              <w:t>5.16</w:t>
             </w:r>
           </w:p>
         </w:tc>
@@ -10025,7 +10025,7 @@
                 <w:color w:val="1C3A36"/>
                 <w:sz w:val="16"/>
               </w:rPr>
-              <w:t>16.00</w:t>
+              <w:t>15.74</w:t>
             </w:r>
           </w:p>
         </w:tc>
@@ -10043,7 +10043,7 @@
                 <w:color w:val="1C3A36"/>
                 <w:sz w:val="16"/>
               </w:rPr>
-              <w:t>16.43</w:t>
+              <w:t>16.16</w:t>
             </w:r>
           </w:p>
         </w:tc>
@@ -10061,7 +10061,7 @@
                 <w:color w:val="1C3A36"/>
                 <w:sz w:val="16"/>
               </w:rPr>
-              <w:t>16.86</w:t>
+              <w:t>16.58</w:t>
             </w:r>
           </w:p>
         </w:tc>
@@ -10079,7 +10079,7 @@
                 <w:color w:val="1C3A36"/>
                 <w:sz w:val="16"/>
               </w:rPr>
-              <w:t>17.28</w:t>
+              <w:t>17.00</w:t>
             </w:r>
           </w:p>
         </w:tc>
@@ -10097,7 +10097,7 @@
                 <w:color w:val="1C3A36"/>
                 <w:sz w:val="16"/>
               </w:rPr>
-              <w:t>17.71</w:t>
+              <w:t>17.42</w:t>
             </w:r>
           </w:p>
         </w:tc>
@@ -10115,7 +10115,7 @@
                 <w:color w:val="1C3A36"/>
                 <w:sz w:val="16"/>
               </w:rPr>
-              <w:t>1.71</w:t>
+              <w:t>1.68</w:t>
             </w:r>
           </w:p>
         </w:tc>
@@ -10152,7 +10152,7 @@
                 <w:color w:val="1C3A36"/>
                 <w:sz w:val="16"/>
               </w:rPr>
-              <w:t>17.94</w:t>
+              <w:t>17.64</w:t>
             </w:r>
           </w:p>
         </w:tc>
@@ -10170,7 +10170,7 @@
                 <w:color w:val="1C3A36"/>
                 <w:sz w:val="16"/>
               </w:rPr>
-              <w:t>17.40</w:t>
+              <w:t>17.11</w:t>
             </w:r>
           </w:p>
         </w:tc>
@@ -10188,7 +10188,7 @@
                 <w:color w:val="1C3A36"/>
                 <w:sz w:val="16"/>
               </w:rPr>
-              <w:t>16.86</w:t>
+              <w:t>16.58</w:t>
             </w:r>
           </w:p>
         </w:tc>
@@ -10206,7 +10206,7 @@
                 <w:color w:val="1C3A36"/>
                 <w:sz w:val="16"/>
               </w:rPr>
-              <w:t>16.31</w:t>
+              <w:t>16.04</w:t>
             </w:r>
           </w:p>
         </w:tc>
@@ -10224,7 +10224,7 @@
                 <w:color w:val="1C3A36"/>
                 <w:sz w:val="16"/>
               </w:rPr>
-              <w:t>15.77</w:t>
+              <w:t>15.51</w:t>
             </w:r>
           </w:p>
         </w:tc>
@@ -10242,7 +10242,7 @@
                 <w:color w:val="1C3A36"/>
                 <w:sz w:val="16"/>
               </w:rPr>
-              <w:t>2.17</w:t>
+              <w:t>2.13</w:t>
             </w:r>
           </w:p>
         </w:tc>
@@ -10279,7 +10279,7 @@
                 <w:color w:val="1C3A36"/>
                 <w:sz w:val="16"/>
               </w:rPr>
-              <w:t>13.75</w:t>
+              <w:t>13.53</w:t>
             </w:r>
           </w:p>
         </w:tc>
@@ -10297,7 +10297,7 @@
                 <w:color w:val="1C3A36"/>
                 <w:sz w:val="16"/>
               </w:rPr>
-              <w:t>14.97</w:t>
+              <w:t>14.72</w:t>
             </w:r>
           </w:p>
         </w:tc>
@@ -10315,7 +10315,7 @@
                 <w:color w:val="1C3A36"/>
                 <w:sz w:val="16"/>
               </w:rPr>
-              <w:t>16.86</w:t>
+              <w:t>16.58</w:t>
             </w:r>
           </w:p>
         </w:tc>
@@ -10333,7 +10333,7 @@
                 <w:color w:val="1C3A36"/>
                 <w:sz w:val="16"/>
               </w:rPr>
-              <w:t>17.51</w:t>
+              <w:t>17.22</w:t>
             </w:r>
           </w:p>
         </w:tc>
@@ -10351,7 +10351,7 @@
                 <w:color w:val="1C3A36"/>
                 <w:sz w:val="16"/>
               </w:rPr>
-              <w:t>18.16</w:t>
+              <w:t>17.86</w:t>
             </w:r>
           </w:p>
         </w:tc>
@@ -10369,7 +10369,7 @@
                 <w:color w:val="1C3A36"/>
                 <w:sz w:val="16"/>
               </w:rPr>
-              <w:t>4.41</w:t>
+              <w:t>4.33</w:t>
             </w:r>
           </w:p>
         </w:tc>
@@ -10406,7 +10406,7 @@
                 <w:color w:val="1C3A36"/>
                 <w:sz w:val="16"/>
               </w:rPr>
-              <w:t>17.83</w:t>
+              <w:t>17.54</w:t>
             </w:r>
           </w:p>
         </w:tc>
@@ -10424,7 +10424,7 @@
                 <w:color w:val="1C3A36"/>
                 <w:sz w:val="16"/>
               </w:rPr>
-              <w:t>17.34</w:t>
+              <w:t>17.06</w:t>
             </w:r>
           </w:p>
         </w:tc>
@@ -10442,7 +10442,7 @@
                 <w:color w:val="1C3A36"/>
                 <w:sz w:val="16"/>
               </w:rPr>
-              <w:t>16.86</w:t>
+              <w:t>16.58</w:t>
             </w:r>
           </w:p>
         </w:tc>
@@ -10460,7 +10460,7 @@
                 <w:color w:val="1C3A36"/>
                 <w:sz w:val="16"/>
               </w:rPr>
-              <w:t>16.21</w:t>
+              <w:t>15.94</w:t>
             </w:r>
           </w:p>
         </w:tc>
@@ -10478,7 +10478,7 @@
                 <w:color w:val="1C3A36"/>
                 <w:sz w:val="16"/>
               </w:rPr>
-              <w:t>15.56</w:t>
+              <w:t>15.30</w:t>
             </w:r>
           </w:p>
         </w:tc>
@@ -10496,7 +10496,7 @@
                 <w:color w:val="1C3A36"/>
                 <w:sz w:val="16"/>
               </w:rPr>
-              <w:t>2.26</w:t>
+              <w:t>2.23</w:t>
             </w:r>
           </w:p>
         </w:tc>
@@ -10533,7 +10533,7 @@
                 <w:color w:val="1C3A36"/>
                 <w:sz w:val="16"/>
               </w:rPr>
-              <w:t>17.60</w:t>
+              <w:t>17.31</w:t>
             </w:r>
           </w:p>
         </w:tc>
@@ -10551,7 +10551,7 @@
                 <w:color w:val="1C3A36"/>
                 <w:sz w:val="16"/>
               </w:rPr>
-              <w:t>17.23</w:t>
+              <w:t>16.95</w:t>
             </w:r>
           </w:p>
         </w:tc>
@@ -10569,7 +10569,7 @@
                 <w:color w:val="1C3A36"/>
                 <w:sz w:val="16"/>
               </w:rPr>
-              <w:t>16.86</w:t>
+              <w:t>16.58</w:t>
             </w:r>
           </w:p>
         </w:tc>
@@ -10587,7 +10587,7 @@
                 <w:color w:val="1C3A36"/>
                 <w:sz w:val="16"/>
               </w:rPr>
-              <w:t>16.47</w:t>
+              <w:t>16.20</w:t>
             </w:r>
           </w:p>
         </w:tc>
@@ -10605,7 +10605,7 @@
                 <w:color w:val="1C3A36"/>
                 <w:sz w:val="16"/>
               </w:rPr>
-              <w:t>16.07</w:t>
+              <w:t>15.80</w:t>
             </w:r>
           </w:p>
         </w:tc>
@@ -10623,7 +10623,7 @@
                 <w:color w:val="1C3A36"/>
                 <w:sz w:val="16"/>
               </w:rPr>
-              <w:t>1.53</w:t>
+              <w:t>1.50</w:t>
             </w:r>
           </w:p>
         </w:tc>
@@ -10659,7 +10659,7 @@
           <w:color w:val="1C3A36"/>
           <w:sz w:val="21"/>
         </w:rPr>
-        <w:t>Two rows deserve a note. The ARPU-drift row is not a generic price sensitivity: it is the mix-exhaustion case set out in 1.6, and it is the largest operating downside in the study — AED 13.75 at -2.5% a year against AED 16.86 in the base. The direct-cost row now scales COST PER UNIT rather than a margin, so it is a driver rather than an assumption being nudged.</w:t>
+        <w:t>Two rows deserve a note. The ARPU-drift row is not a generic price sensitivity: it is the mix-exhaustion case set out in 1.6, and it is the largest operating downside in the study — AED 13.53 at -2.5% a year against AED 16.58 in the base. The direct-cost row now scales COST PER UNIT rather than a margin, so it is a driver rather than an assumption being nudged.</w:t>
       </w:r>
     </w:p>
     <w:p>
@@ -10673,7 +10673,7 @@
           <w:color w:val="1C3A36"/>
           <w:sz w:val="21"/>
         </w:rPr>
-        <w:t>One further test belongs here, because an external review asked for it: what is revenue at the company's guided midpoint worth? The build lands at +4.3% against a guided 4-6%, so the +5.0% midpoint is worth about AED 107mn of FY2026 revenue. The answer depends less on the revenue than on HOW it is won. Won on price, with no incremental unit cost or capex behind it, the cash-flow lens reads AED 17.45; won on volume, carrying both, it reads AED 17.57. On the same five-year revenue the price route is worth AED 0.18 more per share than the volume route. The build deliberately stays below the midpoint: it is driven by the disclosed subscriber and ARPU paths, and reverse-engineering a forecast to a guidance number is the opposite of building it from the ground up.</w:t>
+        <w:t>One further test belongs here, because an external review asked for it: what is revenue at the company's guided midpoint worth? The build lands at +4.3% against a guided 4-6%, so the +5.0% midpoint is worth about AED 107mn of FY2026 revenue. The answer depends less on the revenue than on HOW it is won. Won on price, with no incremental unit cost or capex behind it, the cash-flow lens reads AED 17.16; won on volume, carrying both, it reads AED 17.28. On the same five-year revenue the price route is worth AED 0.18 more per share than the volume route. The build deliberately stays below the midpoint: it is driven by the disclosed subscriber and ARPU paths, and reverse-engineering a forecast to a guidance number is the opposite of building it from the ground up.</w:t>
       </w:r>
     </w:p>
     <w:p>
@@ -11507,7 +11507,7 @@
           <w:color w:val="6E7B77"/>
           <w:sz w:val="17"/>
         </w:rPr>
-        <w:t>Figure 5 — the forward price cone to three months. The dashed brass line is the fundamental central estimate of 16.86; the dotted line is the spot of 11.36.</w:t>
+        <w:t>Figure 5 — the forward price cone to three months. The dashed brass line is the fundamental central estimate of 16.58; the dotted line is the spot of 11.36.</w:t>
       </w:r>
     </w:p>
     <w:p>
@@ -12422,7 +12422,7 @@
           <w:color w:val="1C3A36"/>
           <w:sz w:val="21"/>
         </w:rPr>
-        <w:t>The field disagrees, and the disagreement is informative. The cash-flow lens reads AED 16.86; the two market-anchored lenses read AED 8.90 and AED 8.92; the book lens AED 12.76. The spread is NOT about the forecast — all four lenses consume the same build, and the near-term numbers are anchored on a printed first half. It is about the price of time and certainty: the measured beta prices du's equity at a 6.5% required return, while the regional market, at the peer median multiple, implicitly charges something closer to the return implied by a 15-16× earnings multiple on a slow-growing annuity — two to three points more. Discount this study's own cash flows at that market-implied rate and you get, in effect, the relative lens.</w:t>
+        <w:t>The field disagrees, and the disagreement is informative. The cash-flow lens reads AED 16.58; the two market-anchored lenses read AED 8.90 and AED 8.92; the book lens AED 12.76. The spread is NOT about the forecast — all four lenses consume the same build, and the near-term numbers are anchored on a printed first half. It is about the price of time and certainty: the measured beta prices du's equity at a 6.5% required return, while the regional market, at the peer median multiple, implicitly charges something closer to the return implied by a 15-16× earnings multiple on a slow-growing annuity — two to three points more. Discount this study's own cash flows at that market-implied rate and you get, in effect, the relative lens.</w:t>
       </w:r>
     </w:p>
     <w:p>
@@ -12436,7 +12436,7 @@
           <w:color w:val="1C3A36"/>
           <w:sz w:val="21"/>
         </w:rPr>
-        <w:t>What would close the gap from each side. The DCF is right and the market re-rates if: the fiscal regime is extended on current terms with the floor lapsing or lightening; the licence renews on comparable terms; the war recovery completes; and the data-centre leg starts printing revenue the market can see. The market is right and the DCF is generous if: the royalty regime reverts or worsens (Framing B alone closes most of the gap — AED 14.74); the measured beta understates the true risk of a single-market, single-licence operator (beta 0.80 alone takes the DCF to AED 13.07); or the capital base is older than the depreciation notes imply, which the second reading of those same notes puts at 22.97 years and is worth AED 16.03 a share. The central of AED 16.86 does NOT split the difference: it is the cash-flow lens, published with the cross-checks that disagree with it printed beside it at their own values, so a reader can judge the disagreement instead of receiving a number in which it has already been settled by a weight. An earlier edition of this study did settle it that way and reported AED 12.87, +13% against the price rather than the +48% this study actually holds — and the two market-anchored lenses that carried 45% of that blend are, as 1.4 shows, one reading of one multiple, not two.</w:t>
+        <w:t>What would close the gap from each side. The DCF is right and the market re-rates if: the fiscal regime is extended on current terms with the floor lapsing or lightening; the licence renews on comparable terms; the war recovery completes; and the data-centre leg starts printing revenue the market can see. The market is right and the DCF is generous if: the royalty regime reverts or worsens (Framing B alone closes most of the gap — AED 14.74); the measured beta understates the true risk of a single-market, single-licence operator (beta 0.80 alone takes the DCF to AED 13.07); or the capital base is older than the depreciation notes imply, which the second reading of those same notes puts at 22.97 years and is worth AED 15.77 a share. The central of AED 16.58 does NOT split the difference: it is the cash-flow lens, published with the cross-checks that disagree with it printed beside it at their own values, so a reader can judge the disagreement instead of receiving a number in which it has already been settled by a weight. An earlier edition of this study did settle it that way and reported AED 12.74, +12% against the price rather than the +46% this study actually holds — and the two market-anchored lenses that carried 45% of that blend are, as 1.4 shows, one reading of one multiple, not two.</w:t>
       </w:r>
     </w:p>
     <w:p>
@@ -12450,7 +12450,7 @@
           <w:color w:val="1C3A36"/>
           <w:sz w:val="21"/>
         </w:rPr>
-        <w:t>An external review asked what those weights were worth, and it was right to. Priced against the blend this study published at the time, AED 12.87: moving the market-anchored family from 45% down to a quarter and giving the freed weight to the cash-flow lens read AED 14.46, and giving it to the book lens read AED 13.64 — up to 1.59 a share, and 0.82 between the two destinations. Not immaterial, and the answer was not to choose the weights better. The scheme is gone: the cash-flow lens IS the central at AED 16.86 and the other lenses are published beside it at their own values, so there is no weight left to set. The arithmetic above is kept as the record of what the retired construction did.</w:t>
+        <w:t>An external review asked what those weights were worth, and it was right to. Priced against the blend this study published at the time, AED 12.74: moving the market-anchored family from 45% down to a quarter and giving the freed weight to the cash-flow lens read AED 14.28, and giving it to the book lens read AED 13.51 — up to 1.53 a share, and 0.76 between the two destinations. Not immaterial, and the answer was not to choose the weights better. The scheme is gone: the cash-flow lens IS the central at AED 16.58 and the other lenses are published beside it at their own values, so there is no weight left to set. The arithmetic above is kept as the record of what the retired construction did.</w:t>
       </w:r>
     </w:p>
     <w:p>
@@ -12539,7 +12539,7 @@
           <w:color w:val="1C3A36"/>
           <w:sz w:val="21"/>
         </w:rPr>
-        <w:t>du's own filings describe the 38% + 9% regime as effective 2024-2026. The other operator has disclosed a ministry notification extending the structure through 2029; du's mirroring disclosure — and whether the AED 1.8bn combined floor carries over — is the single most valuable sentence the company can publish: AED 16.86 versus AED 14.74 per share between the framings.</w:t>
+        <w:t>du's own filings describe the 38% + 9% regime as effective 2024-2026. The other operator has disclosed a ministry notification extending the structure through 2029; du's mirroring disclosure — and whether the AED 1.8bn combined floor carries over — is the single most valuable sentence the company can publish: AED 16.58 versus AED 14.74 per share between the framings.</w:t>
       </w:r>
     </w:p>
     <w:p>
@@ -12560,7 +12560,7 @@
           <w:color w:val="1C3A36"/>
           <w:sz w:val="21"/>
         </w:rPr>
-        <w:t>The TDRA extension ran to 8 August 2026 with conclusion expected "on or before" that date — i.e. the outcome is due at press time. Renewal on comparable terms is the base case and would be a non-event; a renewal that raises the fee ratio costs roughly AED 0.56 per share per percentage point of revenue.</w:t>
+        <w:t>The TDRA extension ran to 8 August 2026 with conclusion expected "on or before" that date — i.e. the outcome is due at press time. Renewal on comparable terms is the base case and would be a non-event; a renewal that raises the fee ratio costs roughly AED 0.55 per share per percentage point of revenue.</w:t>
       </w:r>
     </w:p>
     <w:p>
@@ -12664,7 +12664,7 @@
           <w:color w:val="1C3A36"/>
           <w:sz w:val="21"/>
         </w:rPr>
-        <w:t>How to read sections 2-3 against section 1. The three-month cone spans AED 9.82 to 15.32 — the price can visit a lot of places in ninety days without any of them being a statement about value. The fundamental central of AED 16.86 sits OUTSIDE the cone's upper half: reaching it within a quarter would be a strong but not extraordinary move. Three zones, then:</w:t>
+        <w:t>How to read sections 2-3 against section 1. The three-month cone spans AED 9.82 to 15.32 — the price can visit a lot of places in ninety days without any of them being a statement about value. The fundamental central of AED 16.58 sits OUTSIDE the cone's upper half: reaching it within a quarter would be a strong but not extraordinary move. Three zones, then:</w:t>
       </w:r>
     </w:p>
     <w:p>
@@ -12727,7 +12727,7 @@
           <w:color w:val="1C3A36"/>
           <w:sz w:val="21"/>
         </w:rPr>
-        <w:t>the market starting to pay for the recovery and the regime extension before they are printed. Even at the cone's top, AED 15.32, the share would still sit -9% against this study's central and only just above the book floor of AED 12.76 — three months of price movement does not settle a disagreement of this size either way.</w:t>
+        <w:t>the market starting to pay for the recovery and the regime extension before they are printed. Even at the cone's top, AED 15.32, the share would still sit -8% against this study's central and only just above the book floor of AED 12.76 — three months of price movement does not settle a disagreement of this size either way.</w:t>
       </w:r>
     </w:p>
     <w:p>
@@ -12881,7 +12881,7 @@
           <w:color w:val="1C3A36"/>
           <w:sz w:val="21"/>
         </w:rPr>
-        <w:t>The single most fragile revenue judgement in this study is that blended mobile ARPU holds roughly flat. Section 1.6 decomposes why: the flat reported figure is a postpaid mix tailwind worth about +2.6% set against per-leg price erosion of about -2.4%. Both must persist, and keep cancelling, for the path to hold. The mix shift came from a collapse in low-value visitor prepaid SIMs, and this study's own subscriber path assumes prepaid RECOVERS — which removes the tailwind and leaves the erosion exposed. Priced: the cash-flow lens falls to AED 13.89 (-18%). We cannot separate the two legs because du publishes no prepaid or postpaid ARPU, and solving for the ratio across all 21 available quarter pairs gives answers from -45× to 17× — so the gap is flagged, not filled.</w:t>
+        <w:t>The single most fragile revenue judgement in this study is that blended mobile ARPU holds roughly flat. Section 1.6 decomposes why: the flat reported figure is a postpaid mix tailwind worth about +2.6% set against per-leg price erosion of about -2.4%. Both must persist, and keep cancelling, for the path to hold. The mix shift came from a collapse in low-value visitor prepaid SIMs, and this study's own subscriber path assumes prepaid RECOVERS — which removes the tailwind and leaves the erosion exposed. Priced: the cash-flow lens falls to AED 13.66 (-18%). We cannot separate the two legs because du publishes no prepaid or postpaid ARPU, and solving for the ratio across all 21 available quarter pairs gives answers from -45× to 17× — so the gap is flagged, not filled.</w:t>
       </w:r>
     </w:p>
     <w:p>
@@ -17975,7 +17975,7 @@
                 <w:color w:val="1C3A36"/>
                 <w:sz w:val="17"/>
               </w:rPr>
-              <w:t>~AED 0.56/share per +1pp (section 1.9)</w:t>
+              <w:t>~AED 0.55/share per +1pp (section 1.9)</w:t>
             </w:r>
           </w:p>
         </w:tc>
@@ -19738,7 +19738,7 @@
                 <w:color w:val="1C3A36"/>
                 <w:sz w:val="17"/>
               </w:rPr>
-              <w:t>Panel median vs the study's central (16.86)</w:t>
+              <w:t>Panel median vs the study's central (16.58)</w:t>
             </w:r>
           </w:p>
         </w:tc>
@@ -19774,7 +19774,7 @@
                 <w:color w:val="1C3A36"/>
                 <w:sz w:val="17"/>
               </w:rPr>
-              <w:t>0.49</w:t>
+              <w:t>0.22</w:t>
             </w:r>
           </w:p>
         </w:tc>

</xml_diff>